<commit_message>
contrato elite: adiciona item o) social media + cláusula 5.13 proteção ao crédito
</commit_message>
<xml_diff>
--- a/assets/contratos/contrato-elite.docx
+++ b/assets/contratos/contrato-elite.docx
@@ -406,7 +406,21 @@
           <w:sz w:val="22"/>
           <w:szCs w:val="22"/>
         </w:rPr>
-        <w:t xml:space="preserve">n) Suporte via WhatsApp em horário comercial.</w:t>
+        <w:t xml:space="preserve">n) Suporte via WhatsApp em horário comercial;</w:t>
+      </w:r>
+    </w:p>
+    <w:p>
+      <w:pPr>
+        <w:spacing w:after="60"/>
+        <w:ind w:left="360"/>
+      </w:pPr>
+      <w:r>
+        <w:rPr>
+          <w:rFonts w:ascii="Arial" w:cs="Arial" w:eastAsia="Arial" w:hAnsi="Arial"/>
+          <w:sz w:val="22"/>
+          <w:szCs w:val="22"/>
+        </w:rPr>
+        <w:t xml:space="preserve">o) Implementação de social media do setup estratégico, sendo 2 (dois) stories diários, 2 (dois) posts estáticos no feed e 1 (um) reels por semana.</w:t>
       </w:r>
     </w:p>
     <w:p>
@@ -665,15 +679,7 @@
           <w:sz w:val="22"/>
           <w:szCs w:val="22"/>
         </w:rPr>
-        <w:t xml:space="preserve">5.1. Pelos serviços prestados, a CONTRATANTE pagará à CONTRATADA </w:t>
-      </w:r>
-      <w:r>
-        <w:rPr>
-          <w:rFonts w:ascii="Arial" w:cs="Arial" w:eastAsia="Arial" w:hAnsi="Arial"/>
-          <w:sz w:val="22"/>
-          <w:szCs w:val="22"/>
-        </w:rPr>
-        <w:t xml:space="preserve">{forma_pagamento}</w:t>
+        <w:t>5.1. Pelos serviços prestados, a CONTRATANTE pagará à CONTRATADA {forma_pagamento}</w:t>
       </w:r>
     </w:p>
     <w:p>
@@ -833,23 +839,7 @@
           <w:sz w:val="22"/>
           <w:szCs w:val="22"/>
         </w:rPr>
-        <w:t xml:space="preserve">5.9. O presente contrato possui prazo mínimo de vigência de </w:t>
-      </w:r>
-      <w:r>
-        <w:rPr>
-          <w:rFonts w:ascii="Arial" w:cs="Arial" w:eastAsia="Arial" w:hAnsi="Arial"/>
-          <w:sz w:val="22"/>
-          <w:szCs w:val="22"/>
-        </w:rPr>
-        <w:t xml:space="preserve">{duracao_meses}</w:t>
-      </w:r>
-      <w:r>
-        <w:rPr>
-          <w:rFonts w:ascii="Arial" w:cs="Arial" w:eastAsia="Arial" w:hAnsi="Arial"/>
-          <w:sz w:val="22"/>
-          <w:szCs w:val="22"/>
-        </w:rPr>
-        <w:t xml:space="preserve"> meses, permanecendo as partes vinculadas ao período integral contratado.</w:t>
+        <w:t>5.9. O presente contrato possui prazo mínimo de vigência de {duracao_meses} meses, permanecendo as partes vinculadas ao período integral contratado.</w:t>
       </w:r>
     </w:p>
     <w:p>
@@ -967,6 +957,19 @@
           <w:szCs w:val="22"/>
         </w:rPr>
         <w:t xml:space="preserve">5.12. A rescisão contratual, independentemente do motivo, não desobriga a CONTRATANTE do pagamento dos valores vencidos até a data do encerramento efetivo da relação contratual.</w:t>
+      </w:r>
+    </w:p>
+    <w:p>
+      <w:pPr>
+        <w:spacing w:after="160"/>
+      </w:pPr>
+      <w:r>
+        <w:rPr>
+          <w:rFonts w:ascii="Arial" w:cs="Arial" w:eastAsia="Arial" w:hAnsi="Arial"/>
+          <w:sz w:val="22"/>
+          <w:szCs w:val="22"/>
+        </w:rPr>
+        <w:t xml:space="preserve">5.13. Caso qualquer pagamento permaneça em atraso por período superior a 30 (trinta) dias corridos, contados da respectiva data de vencimento, a CONTRATADA poderá, após tentativa de cobrança amigável, encaminhar o débito e os dados cadastrais da CONTRATANTE aos órgãos de proteção ao crédito, incluindo SERASA, SPC Brasil e entidades congêneres. A inclusão do débito nos órgãos de proteção ao crédito não impede a CONTRATADA de adotar outras medidas extrajudiciais ou judiciais para cobrança dos valores devidos, acrescidos da multa, juros, correção monetária e demais encargos previstos neste contrato.</w:t>
       </w:r>
     </w:p>
     <w:p>

</xml_diff>